<commit_message>
SOC builder: scanned TOR build through the shared OCR queue (confirm, queue place, pages done, cancel, resume, restart pickup)
Co-Authored-By: Claude Sonnet 5.5 <noreply@anthropic.com>
</commit_message>
<xml_diff>
--- a/.scratch/soc-builder/dev/_draft-0.docx
+++ b/.scratch/soc-builder/dev/_draft-0.docx
@@ -5452,8 +5452,27 @@
               <w:t xml:space="preserve">IEC 61300-3-6</w:t>
               <w:br/>
               <w:t xml:space="preserve">Or GR-326</w:t>
-              <w:br/>
-              <w:t xml:space="preserve">- Operating Temperature : - 40 C– 75 C</w:t>
+            </w:r>
+          </w:p>
+        </w:tc>
+        <w:tc>
+          <w:p/>
+        </w:tc>
+        <w:tc>
+          <w:p/>
+        </w:tc>
+        <w:tc>
+          <w:p/>
+        </w:tc>
+      </w:tr>
+      <w:tr>
+        <w:tc>
+          <w:p/>
+        </w:tc>
+        <w:tc>
+          <w:p>
+            <w:r>
+              <w:t xml:space="preserve">Operating Temperature : - 40 C– 75 C</w:t>
             </w:r>
           </w:p>
         </w:tc>
@@ -5497,12 +5516,50 @@
               <w:t xml:space="preserve">References</w:t>
               <w:br/>
               <w:t xml:space="preserve">Appearance</w:t>
-              <w:br/>
-              <w:t xml:space="preserve">- Exam the product</w:t>
+            </w:r>
+          </w:p>
+        </w:tc>
+        <w:tc>
+          <w:p/>
+        </w:tc>
+        <w:tc>
+          <w:p/>
+        </w:tc>
+        <w:tc>
+          <w:p/>
+        </w:tc>
+      </w:tr>
+      <w:tr>
+        <w:tc>
+          <w:p/>
+        </w:tc>
+        <w:tc>
+          <w:p>
+            <w:r>
+              <w:t xml:space="preserve">Exam the product</w:t>
               <w:br/>
               <w:t xml:space="preserve">with the naked eye</w:t>
-              <w:br/>
-              <w:t xml:space="preserve">- No deformation,</w:t>
+            </w:r>
+          </w:p>
+        </w:tc>
+        <w:tc>
+          <w:p/>
+        </w:tc>
+        <w:tc>
+          <w:p/>
+        </w:tc>
+        <w:tc>
+          <w:p/>
+        </w:tc>
+      </w:tr>
+      <w:tr>
+        <w:tc>
+          <w:p/>
+        </w:tc>
+        <w:tc>
+          <w:p>
+            <w:r>
+              <w:t xml:space="preserve">No deformation,</w:t>
               <w:br/>
               <w:t xml:space="preserve">crack,scratch, flaw,</w:t>
               <w:br/>
@@ -5511,24 +5568,157 @@
               <w:t xml:space="preserve">burr.</w:t>
               <w:br/>
               <w:t xml:space="preserve">Tensile Strength</w:t>
-              <w:br/>
-              <w:t xml:space="preserve">- Patch cord maximum</w:t>
+            </w:r>
+          </w:p>
+        </w:tc>
+        <w:tc>
+          <w:p/>
+        </w:tc>
+        <w:tc>
+          <w:p/>
+        </w:tc>
+        <w:tc>
+          <w:p/>
+        </w:tc>
+      </w:tr>
+      <w:tr>
+        <w:tc>
+          <w:p/>
+        </w:tc>
+        <w:tc>
+          <w:p>
+            <w:r>
+              <w:t xml:space="preserve">Patch cord maximum</w:t>
               <w:br/>
               <w:t xml:space="preserve">tensile strength:70 N</w:t>
-              <w:br/>
-              <w:t xml:space="preserve">- Rate : 0 N to full load</w:t>
+            </w:r>
+          </w:p>
+        </w:tc>
+        <w:tc>
+          <w:p/>
+        </w:tc>
+        <w:tc>
+          <w:p/>
+        </w:tc>
+        <w:tc>
+          <w:p/>
+        </w:tc>
+      </w:tr>
+      <w:tr>
+        <w:tc>
+          <w:p/>
+        </w:tc>
+        <w:tc>
+          <w:p>
+            <w:r>
+              <w:t xml:space="preserve">Rate : 0 N to full load</w:t>
               <w:br/>
               <w:t xml:space="preserve">in 15 sec</w:t>
-              <w:br/>
-              <w:t xml:space="preserve">- ΔIL  ≤ 0.2 dB</w:t>
-              <w:br/>
-              <w:t xml:space="preserve">- ΔRL ≤ 2 dB</w:t>
-              <w:br/>
-              <w:t xml:space="preserve">- Appearance</w:t>
-              <w:br/>
-              <w:t xml:space="preserve">- IEC-61300-2-4</w:t>
-              <w:br/>
-              <w:t xml:space="preserve">- Or GR- 326</w:t>
+            </w:r>
+          </w:p>
+        </w:tc>
+        <w:tc>
+          <w:p/>
+        </w:tc>
+        <w:tc>
+          <w:p/>
+        </w:tc>
+        <w:tc>
+          <w:p/>
+        </w:tc>
+      </w:tr>
+      <w:tr>
+        <w:tc>
+          <w:p/>
+        </w:tc>
+        <w:tc>
+          <w:p>
+            <w:r>
+              <w:t xml:space="preserve">ΔIL  ≤ 0.2 dB</w:t>
+            </w:r>
+          </w:p>
+        </w:tc>
+        <w:tc>
+          <w:p/>
+        </w:tc>
+        <w:tc>
+          <w:p/>
+        </w:tc>
+        <w:tc>
+          <w:p/>
+        </w:tc>
+      </w:tr>
+      <w:tr>
+        <w:tc>
+          <w:p/>
+        </w:tc>
+        <w:tc>
+          <w:p>
+            <w:r>
+              <w:t xml:space="preserve">ΔRL ≤ 2 dB</w:t>
+            </w:r>
+          </w:p>
+        </w:tc>
+        <w:tc>
+          <w:p/>
+        </w:tc>
+        <w:tc>
+          <w:p/>
+        </w:tc>
+        <w:tc>
+          <w:p/>
+        </w:tc>
+      </w:tr>
+      <w:tr>
+        <w:tc>
+          <w:p/>
+        </w:tc>
+        <w:tc>
+          <w:p>
+            <w:r>
+              <w:t xml:space="preserve">Appearance</w:t>
+            </w:r>
+          </w:p>
+        </w:tc>
+        <w:tc>
+          <w:p/>
+        </w:tc>
+        <w:tc>
+          <w:p/>
+        </w:tc>
+        <w:tc>
+          <w:p/>
+        </w:tc>
+      </w:tr>
+      <w:tr>
+        <w:tc>
+          <w:p/>
+        </w:tc>
+        <w:tc>
+          <w:p>
+            <w:r>
+              <w:t xml:space="preserve">IEC-61300-2-4</w:t>
+            </w:r>
+          </w:p>
+        </w:tc>
+        <w:tc>
+          <w:p/>
+        </w:tc>
+        <w:tc>
+          <w:p/>
+        </w:tc>
+        <w:tc>
+          <w:p/>
+        </w:tc>
+      </w:tr>
+      <w:tr>
+        <w:tc>
+          <w:p/>
+        </w:tc>
+        <w:tc>
+          <w:p>
+            <w:r>
+              <w:t xml:space="preserve">Or GR- 326</w:t>
               <w:br/>
               <w:t xml:space="preserve">Test item</w:t>
               <w:br/>
@@ -5537,112 +5727,701 @@
               <w:t xml:space="preserve">Requirements</w:t>
               <w:br/>
               <w:t xml:space="preserve">References</w:t>
-              <w:br/>
-              <w:t xml:space="preserve">- Point of application :</w:t>
+            </w:r>
+          </w:p>
+        </w:tc>
+        <w:tc>
+          <w:p/>
+        </w:tc>
+        <w:tc>
+          <w:p/>
+        </w:tc>
+        <w:tc>
+          <w:p/>
+        </w:tc>
+      </w:tr>
+      <w:tr>
+        <w:tc>
+          <w:p/>
+        </w:tc>
+        <w:tc>
+          <w:p>
+            <w:r>
+              <w:t xml:space="preserve">Point of application :</w:t>
               <w:br/>
               <w:t xml:space="preserve">500 millimeter  from</w:t>
               <w:br/>
               <w:t xml:space="preserve">plug</w:t>
-              <w:br/>
-              <w:t xml:space="preserve">- Duration 1 minute</w:t>
+            </w:r>
+          </w:p>
+        </w:tc>
+        <w:tc>
+          <w:p/>
+        </w:tc>
+        <w:tc>
+          <w:p/>
+        </w:tc>
+        <w:tc>
+          <w:p/>
+        </w:tc>
+      </w:tr>
+      <w:tr>
+        <w:tc>
+          <w:p/>
+        </w:tc>
+        <w:tc>
+          <w:p>
+            <w:r>
+              <w:t xml:space="preserve">Duration 1 minute</w:t>
               <w:br/>
               <w:t xml:space="preserve">Endurance</w:t>
-              <w:br/>
-              <w:t xml:space="preserve">- Mating and demating</w:t>
+            </w:r>
+          </w:p>
+        </w:tc>
+        <w:tc>
+          <w:p/>
+        </w:tc>
+        <w:tc>
+          <w:p/>
+        </w:tc>
+        <w:tc>
+          <w:p/>
+        </w:tc>
+      </w:tr>
+      <w:tr>
+        <w:tc>
+          <w:p/>
+        </w:tc>
+        <w:tc>
+          <w:p>
+            <w:r>
+              <w:t xml:space="preserve">Mating and demating</w:t>
               <w:br/>
               <w:t xml:space="preserve">500 times</w:t>
-              <w:br/>
-              <w:t xml:space="preserve">- ΔIL  ≤ 0.2 dB</w:t>
-              <w:br/>
-              <w:t xml:space="preserve">- ΔRL ≤ 2 dB</w:t>
-              <w:br/>
-              <w:t xml:space="preserve">- Appearance</w:t>
-              <w:br/>
-              <w:t xml:space="preserve">- IEC-61300-2-2</w:t>
-              <w:br/>
-              <w:t xml:space="preserve">- Or GR- 326</w:t>
+            </w:r>
+          </w:p>
+        </w:tc>
+        <w:tc>
+          <w:p/>
+        </w:tc>
+        <w:tc>
+          <w:p/>
+        </w:tc>
+        <w:tc>
+          <w:p/>
+        </w:tc>
+      </w:tr>
+      <w:tr>
+        <w:tc>
+          <w:p/>
+        </w:tc>
+        <w:tc>
+          <w:p>
+            <w:r>
+              <w:t xml:space="preserve">ΔIL  ≤ 0.2 dB</w:t>
+            </w:r>
+          </w:p>
+        </w:tc>
+        <w:tc>
+          <w:p/>
+        </w:tc>
+        <w:tc>
+          <w:p/>
+        </w:tc>
+        <w:tc>
+          <w:p/>
+        </w:tc>
+      </w:tr>
+      <w:tr>
+        <w:tc>
+          <w:p/>
+        </w:tc>
+        <w:tc>
+          <w:p>
+            <w:r>
+              <w:t xml:space="preserve">ΔRL ≤ 2 dB</w:t>
+            </w:r>
+          </w:p>
+        </w:tc>
+        <w:tc>
+          <w:p/>
+        </w:tc>
+        <w:tc>
+          <w:p/>
+        </w:tc>
+        <w:tc>
+          <w:p/>
+        </w:tc>
+      </w:tr>
+      <w:tr>
+        <w:tc>
+          <w:p/>
+        </w:tc>
+        <w:tc>
+          <w:p>
+            <w:r>
+              <w:t xml:space="preserve">Appearance</w:t>
+            </w:r>
+          </w:p>
+        </w:tc>
+        <w:tc>
+          <w:p/>
+        </w:tc>
+        <w:tc>
+          <w:p/>
+        </w:tc>
+        <w:tc>
+          <w:p/>
+        </w:tc>
+      </w:tr>
+      <w:tr>
+        <w:tc>
+          <w:p/>
+        </w:tc>
+        <w:tc>
+          <w:p>
+            <w:r>
+              <w:t xml:space="preserve">IEC-61300-2-2</w:t>
+            </w:r>
+          </w:p>
+        </w:tc>
+        <w:tc>
+          <w:p/>
+        </w:tc>
+        <w:tc>
+          <w:p/>
+        </w:tc>
+        <w:tc>
+          <w:p/>
+        </w:tc>
+      </w:tr>
+      <w:tr>
+        <w:tc>
+          <w:p/>
+        </w:tc>
+        <w:tc>
+          <w:p>
+            <w:r>
+              <w:t xml:space="preserve">Or GR- 326</w:t>
               <w:br/>
               <w:t xml:space="preserve">Strength of</w:t>
               <w:br/>
               <w:t xml:space="preserve">Coupling Mechanism</w:t>
-              <w:br/>
-              <w:t xml:space="preserve">- Patch cord maximum</w:t>
+            </w:r>
+          </w:p>
+        </w:tc>
+        <w:tc>
+          <w:p/>
+        </w:tc>
+        <w:tc>
+          <w:p/>
+        </w:tc>
+        <w:tc>
+          <w:p/>
+        </w:tc>
+      </w:tr>
+      <w:tr>
+        <w:tc>
+          <w:p/>
+        </w:tc>
+        <w:tc>
+          <w:p>
+            <w:r>
+              <w:t xml:space="preserve">Patch cord maximum</w:t>
               <w:br/>
               <w:t xml:space="preserve">tensile strength:40 N</w:t>
-              <w:br/>
-              <w:t xml:space="preserve">- Rate : 0 N to full load</w:t>
+            </w:r>
+          </w:p>
+        </w:tc>
+        <w:tc>
+          <w:p/>
+        </w:tc>
+        <w:tc>
+          <w:p/>
+        </w:tc>
+        <w:tc>
+          <w:p/>
+        </w:tc>
+      </w:tr>
+      <w:tr>
+        <w:tc>
+          <w:p/>
+        </w:tc>
+        <w:tc>
+          <w:p>
+            <w:r>
+              <w:t xml:space="preserve">Rate : 0 N to full load</w:t>
               <w:br/>
               <w:t xml:space="preserve">in 15 sec</w:t>
-              <w:br/>
-              <w:t xml:space="preserve">- Point of application :</w:t>
+            </w:r>
+          </w:p>
+        </w:tc>
+        <w:tc>
+          <w:p/>
+        </w:tc>
+        <w:tc>
+          <w:p/>
+        </w:tc>
+        <w:tc>
+          <w:p/>
+        </w:tc>
+      </w:tr>
+      <w:tr>
+        <w:tc>
+          <w:p/>
+        </w:tc>
+        <w:tc>
+          <w:p>
+            <w:r>
+              <w:t xml:space="preserve">Point of application :</w:t>
               <w:br/>
               <w:t xml:space="preserve">500 millimeter  from</w:t>
               <w:br/>
               <w:t xml:space="preserve">plug</w:t>
-              <w:br/>
-              <w:t xml:space="preserve">- Duration 1 minute</w:t>
-              <w:br/>
-              <w:t xml:space="preserve">- ΔIL  ≤ 0.2 dB</w:t>
-              <w:br/>
-              <w:t xml:space="preserve">- ΔRL ≤ 2 dB</w:t>
-              <w:br/>
-              <w:t xml:space="preserve">- Appearance</w:t>
-              <w:br/>
-              <w:t xml:space="preserve">- IEC-61300-2-6</w:t>
-              <w:br/>
-              <w:t xml:space="preserve">- Or GR- 326</w:t>
+            </w:r>
+          </w:p>
+        </w:tc>
+        <w:tc>
+          <w:p/>
+        </w:tc>
+        <w:tc>
+          <w:p/>
+        </w:tc>
+        <w:tc>
+          <w:p/>
+        </w:tc>
+      </w:tr>
+      <w:tr>
+        <w:tc>
+          <w:p/>
+        </w:tc>
+        <w:tc>
+          <w:p>
+            <w:r>
+              <w:t xml:space="preserve">Duration 1 minute</w:t>
+            </w:r>
+          </w:p>
+        </w:tc>
+        <w:tc>
+          <w:p/>
+        </w:tc>
+        <w:tc>
+          <w:p/>
+        </w:tc>
+        <w:tc>
+          <w:p/>
+        </w:tc>
+      </w:tr>
+      <w:tr>
+        <w:tc>
+          <w:p/>
+        </w:tc>
+        <w:tc>
+          <w:p>
+            <w:r>
+              <w:t xml:space="preserve">ΔIL  ≤ 0.2 dB</w:t>
+            </w:r>
+          </w:p>
+        </w:tc>
+        <w:tc>
+          <w:p/>
+        </w:tc>
+        <w:tc>
+          <w:p/>
+        </w:tc>
+        <w:tc>
+          <w:p/>
+        </w:tc>
+      </w:tr>
+      <w:tr>
+        <w:tc>
+          <w:p/>
+        </w:tc>
+        <w:tc>
+          <w:p>
+            <w:r>
+              <w:t xml:space="preserve">ΔRL ≤ 2 dB</w:t>
+            </w:r>
+          </w:p>
+        </w:tc>
+        <w:tc>
+          <w:p/>
+        </w:tc>
+        <w:tc>
+          <w:p/>
+        </w:tc>
+        <w:tc>
+          <w:p/>
+        </w:tc>
+      </w:tr>
+      <w:tr>
+        <w:tc>
+          <w:p/>
+        </w:tc>
+        <w:tc>
+          <w:p>
+            <w:r>
+              <w:t xml:space="preserve">Appearance</w:t>
+            </w:r>
+          </w:p>
+        </w:tc>
+        <w:tc>
+          <w:p/>
+        </w:tc>
+        <w:tc>
+          <w:p/>
+        </w:tc>
+        <w:tc>
+          <w:p/>
+        </w:tc>
+      </w:tr>
+      <w:tr>
+        <w:tc>
+          <w:p/>
+        </w:tc>
+        <w:tc>
+          <w:p>
+            <w:r>
+              <w:t xml:space="preserve">IEC-61300-2-6</w:t>
+            </w:r>
+          </w:p>
+        </w:tc>
+        <w:tc>
+          <w:p/>
+        </w:tc>
+        <w:tc>
+          <w:p/>
+        </w:tc>
+        <w:tc>
+          <w:p/>
+        </w:tc>
+      </w:tr>
+      <w:tr>
+        <w:tc>
+          <w:p/>
+        </w:tc>
+        <w:tc>
+          <w:p>
+            <w:r>
+              <w:t xml:space="preserve">Or GR- 326</w:t>
               <w:br/>
               <w:t xml:space="preserve">Torsion</w:t>
-              <w:br/>
-              <w:t xml:space="preserve">- Maximum load:15 N</w:t>
-              <w:br/>
-              <w:t xml:space="preserve">- Cable clamp distance</w:t>
+            </w:r>
+          </w:p>
+        </w:tc>
+        <w:tc>
+          <w:p/>
+        </w:tc>
+        <w:tc>
+          <w:p/>
+        </w:tc>
+        <w:tc>
+          <w:p/>
+        </w:tc>
+      </w:tr>
+      <w:tr>
+        <w:tc>
+          <w:p/>
+        </w:tc>
+        <w:tc>
+          <w:p>
+            <w:r>
+              <w:t xml:space="preserve">Maximum load:15 N</w:t>
+            </w:r>
+          </w:p>
+        </w:tc>
+        <w:tc>
+          <w:p/>
+        </w:tc>
+        <w:tc>
+          <w:p/>
+        </w:tc>
+        <w:tc>
+          <w:p/>
+        </w:tc>
+      </w:tr>
+      <w:tr>
+        <w:tc>
+          <w:p/>
+        </w:tc>
+        <w:tc>
+          <w:p>
+            <w:r>
+              <w:t xml:space="preserve">Cable clamp distance</w:t>
               <w:br/>
               <w:t xml:space="preserve">: 200 millimeter from</w:t>
               <w:br/>
               <w:t xml:space="preserve">the tip</w:t>
-              <w:br/>
-              <w:t xml:space="preserve">- Torsion:+180°/-180°</w:t>
-              <w:br/>
-              <w:t xml:space="preserve">- Cycles:25</w:t>
-              <w:br/>
-              <w:t xml:space="preserve">- ΔIL  ≤ 0.2 dB</w:t>
-              <w:br/>
-              <w:t xml:space="preserve">- ΔRL ≤ 2 dB</w:t>
-              <w:br/>
-              <w:t xml:space="preserve">- Appearance</w:t>
-              <w:br/>
-              <w:t xml:space="preserve">- IEC-61300-2-5</w:t>
-              <w:br/>
-              <w:t xml:space="preserve">- Or GR- 326</w:t>
+            </w:r>
+          </w:p>
+        </w:tc>
+        <w:tc>
+          <w:p/>
+        </w:tc>
+        <w:tc>
+          <w:p/>
+        </w:tc>
+        <w:tc>
+          <w:p/>
+        </w:tc>
+      </w:tr>
+      <w:tr>
+        <w:tc>
+          <w:p/>
+        </w:tc>
+        <w:tc>
+          <w:p>
+            <w:r>
+              <w:t xml:space="preserve">Torsion:+180°/-180°</w:t>
+            </w:r>
+          </w:p>
+        </w:tc>
+        <w:tc>
+          <w:p/>
+        </w:tc>
+        <w:tc>
+          <w:p/>
+        </w:tc>
+        <w:tc>
+          <w:p/>
+        </w:tc>
+      </w:tr>
+      <w:tr>
+        <w:tc>
+          <w:p/>
+        </w:tc>
+        <w:tc>
+          <w:p>
+            <w:r>
+              <w:t xml:space="preserve">Cycles:25</w:t>
+            </w:r>
+          </w:p>
+        </w:tc>
+        <w:tc>
+          <w:p/>
+        </w:tc>
+        <w:tc>
+          <w:p/>
+        </w:tc>
+        <w:tc>
+          <w:p/>
+        </w:tc>
+      </w:tr>
+      <w:tr>
+        <w:tc>
+          <w:p/>
+        </w:tc>
+        <w:tc>
+          <w:p>
+            <w:r>
+              <w:t xml:space="preserve">ΔIL  ≤ 0.2 dB</w:t>
+            </w:r>
+          </w:p>
+        </w:tc>
+        <w:tc>
+          <w:p/>
+        </w:tc>
+        <w:tc>
+          <w:p/>
+        </w:tc>
+        <w:tc>
+          <w:p/>
+        </w:tc>
+      </w:tr>
+      <w:tr>
+        <w:tc>
+          <w:p/>
+        </w:tc>
+        <w:tc>
+          <w:p>
+            <w:r>
+              <w:t xml:space="preserve">ΔRL ≤ 2 dB</w:t>
+            </w:r>
+          </w:p>
+        </w:tc>
+        <w:tc>
+          <w:p/>
+        </w:tc>
+        <w:tc>
+          <w:p/>
+        </w:tc>
+        <w:tc>
+          <w:p/>
+        </w:tc>
+      </w:tr>
+      <w:tr>
+        <w:tc>
+          <w:p/>
+        </w:tc>
+        <w:tc>
+          <w:p>
+            <w:r>
+              <w:t xml:space="preserve">Appearance</w:t>
+            </w:r>
+          </w:p>
+        </w:tc>
+        <w:tc>
+          <w:p/>
+        </w:tc>
+        <w:tc>
+          <w:p/>
+        </w:tc>
+        <w:tc>
+          <w:p/>
+        </w:tc>
+      </w:tr>
+      <w:tr>
+        <w:tc>
+          <w:p/>
+        </w:tc>
+        <w:tc>
+          <w:p>
+            <w:r>
+              <w:t xml:space="preserve">IEC-61300-2-5</w:t>
+            </w:r>
+          </w:p>
+        </w:tc>
+        <w:tc>
+          <w:p/>
+        </w:tc>
+        <w:tc>
+          <w:p/>
+        </w:tc>
+        <w:tc>
+          <w:p/>
+        </w:tc>
+      </w:tr>
+      <w:tr>
+        <w:tc>
+          <w:p/>
+        </w:tc>
+        <w:tc>
+          <w:p>
+            <w:r>
+              <w:t xml:space="preserve">Or GR- 326</w:t>
               <w:br/>
               <w:t xml:space="preserve">Strippability</w:t>
-              <w:br/>
-              <w:t xml:space="preserve">- Strip the outer jacket</w:t>
+            </w:r>
+          </w:p>
+        </w:tc>
+        <w:tc>
+          <w:p/>
+        </w:tc>
+        <w:tc>
+          <w:p/>
+        </w:tc>
+        <w:tc>
+          <w:p/>
+        </w:tc>
+      </w:tr>
+      <w:tr>
+        <w:tc>
+          <w:p/>
+        </w:tc>
+        <w:tc>
+          <w:p>
+            <w:r>
+              <w:t xml:space="preserve">Strip the outer jacket</w:t>
               <w:br/>
               <w:t xml:space="preserve">out of patch cord in one</w:t>
               <w:br/>
               <w:t xml:space="preserve">action (one time)</w:t>
-              <w:br/>
-              <w:t xml:space="preserve">- Strip tight buffer tube</w:t>
+            </w:r>
+          </w:p>
+        </w:tc>
+        <w:tc>
+          <w:p/>
+        </w:tc>
+        <w:tc>
+          <w:p/>
+        </w:tc>
+        <w:tc>
+          <w:p/>
+        </w:tc>
+      </w:tr>
+      <w:tr>
+        <w:tc>
+          <w:p/>
+        </w:tc>
+        <w:tc>
+          <w:p>
+            <w:r>
+              <w:t xml:space="preserve">Strip tight buffer tube</w:t>
               <w:br/>
               <w:t xml:space="preserve">out of fiber in one</w:t>
               <w:br/>
               <w:t xml:space="preserve">action(one time)</w:t>
-              <w:br/>
-              <w:t xml:space="preserve">- Use commercially</w:t>
+            </w:r>
+          </w:p>
+        </w:tc>
+        <w:tc>
+          <w:p/>
+        </w:tc>
+        <w:tc>
+          <w:p/>
+        </w:tc>
+        <w:tc>
+          <w:p/>
+        </w:tc>
+      </w:tr>
+      <w:tr>
+        <w:tc>
+          <w:p/>
+        </w:tc>
+        <w:tc>
+          <w:p>
+            <w:r>
+              <w:t xml:space="preserve">Use commercially</w:t>
               <w:br/>
               <w:t xml:space="preserve">available tools</w:t>
-              <w:br/>
-              <w:t xml:space="preserve">- Minimum length of</w:t>
+            </w:r>
+          </w:p>
+        </w:tc>
+        <w:tc>
+          <w:p/>
+        </w:tc>
+        <w:tc>
+          <w:p/>
+        </w:tc>
+        <w:tc>
+          <w:p/>
+        </w:tc>
+      </w:tr>
+      <w:tr>
+        <w:tc>
+          <w:p/>
+        </w:tc>
+        <w:tc>
+          <w:p>
+            <w:r>
+              <w:t xml:space="preserve">Minimum length of</w:t>
               <w:br/>
               <w:t xml:space="preserve">the outer jacket shall be</w:t>
               <w:br/>
               <w:t xml:space="preserve">capable to be Stripped</w:t>
               <w:br/>
               <w:t xml:space="preserve">to 1 meter</w:t>
-              <w:br/>
-              <w:t xml:space="preserve">- Minimum length of</w:t>
+            </w:r>
+          </w:p>
+        </w:tc>
+        <w:tc>
+          <w:p/>
+        </w:tc>
+        <w:tc>
+          <w:p/>
+        </w:tc>
+        <w:tc>
+          <w:p/>
+        </w:tc>
+      </w:tr>
+      <w:tr>
+        <w:tc>
+          <w:p/>
+        </w:tc>
+        <w:tc>
+          <w:p>
+            <w:r>
+              <w:t xml:space="preserve">Minimum length of</w:t>
               <w:br/>
               <w:t xml:space="preserve">the tight buffer tube</w:t>
               <w:br/>
@@ -5684,18 +6463,75 @@
                 <w:bCs/>
               </w:rPr>
               <w:t xml:space="preserve">Marking</w:t>
-              <w:br/>
-              <w:t xml:space="preserve">- The Fiber Optic Pigtail shall be marked on the connector or the boot or the fiber cord( jacket) with</w:t>
+            </w:r>
+          </w:p>
+        </w:tc>
+        <w:tc>
+          <w:p/>
+        </w:tc>
+        <w:tc>
+          <w:p/>
+        </w:tc>
+        <w:tc>
+          <w:p/>
+        </w:tc>
+      </w:tr>
+      <w:tr>
+        <w:tc>
+          <w:p/>
+        </w:tc>
+        <w:tc>
+          <w:p>
+            <w:r>
+              <w:t xml:space="preserve">The Fiber Optic Pigtail shall be marked on the connector or the boot or the fiber cord( jacket) with</w:t>
               <w:br/>
               <w:t xml:space="preserve">manufacturer’s name or trademark.</w:t>
-              <w:br/>
-              <w:t xml:space="preserve">- The Fiber Optic Pigtail jacket shall be provided length marking at intervals of approximately 1 meter along</w:t>
+            </w:r>
+          </w:p>
+        </w:tc>
+        <w:tc>
+          <w:p/>
+        </w:tc>
+        <w:tc>
+          <w:p/>
+        </w:tc>
+        <w:tc>
+          <w:p/>
+        </w:tc>
+      </w:tr>
+      <w:tr>
+        <w:tc>
+          <w:p/>
+        </w:tc>
+        <w:tc>
+          <w:p>
+            <w:r>
+              <w:t xml:space="preserve">The Fiber Optic Pigtail jacket shall be provided length marking at intervals of approximately 1 meter along</w:t>
               <w:br/>
               <w:t xml:space="preserve">the whole patch cord length. The accuracy of the measurement of length marking  shall be held within the</w:t>
               <w:br/>
               <w:t xml:space="preserve">limits of ± 1%</w:t>
-              <w:br/>
-              <w:t xml:space="preserve">- The Fiber Optic Pigtail jacket identification marking. Each length marking interval, the identification marking</w:t>
+            </w:r>
+          </w:p>
+        </w:tc>
+        <w:tc>
+          <w:p/>
+        </w:tc>
+        <w:tc>
+          <w:p/>
+        </w:tc>
+        <w:tc>
+          <w:p/>
+        </w:tc>
+      </w:tr>
+      <w:tr>
+        <w:tc>
+          <w:p/>
+        </w:tc>
+        <w:tc>
+          <w:p>
+            <w:r>
+              <w:t xml:space="preserve">The Fiber Optic Pigtail jacket identification marking. Each length marking interval, the identification marking</w:t>
               <w:br/>
               <w:t xml:space="preserve">shall be permanently identified as the followings:</w:t>
               <w:br/>
@@ -5706,8 +6542,27 @@
               <w:t xml:space="preserve">year (C.E) of fiber cord manufacture or finished product manufacture</w:t>
               <w:br/>
               <w:t xml:space="preserve">Type of fiber and jacket, O.D. such as SMOF…..PE-FR-LS-ZH, O.D. etc.</w:t>
-              <w:br/>
-              <w:t xml:space="preserve">- For traceability purpose, necessary information shall be placed on both side of the patch cord for instance:-</w:t>
+            </w:r>
+          </w:p>
+        </w:tc>
+        <w:tc>
+          <w:p/>
+        </w:tc>
+        <w:tc>
+          <w:p/>
+        </w:tc>
+        <w:tc>
+          <w:p/>
+        </w:tc>
+      </w:tr>
+      <w:tr>
+        <w:tc>
+          <w:p/>
+        </w:tc>
+        <w:tc>
+          <w:p>
+            <w:r>
+              <w:t xml:space="preserve">For traceability purpose, necessary information shall be placed on both side of the patch cord for instance:-</w:t>
               <w:br/>
               <w:t xml:space="preserve">the trace label etc.</w:t>
             </w:r>

</xml_diff>